<commit_message>
some cosmetic changes and small fixes
</commit_message>
<xml_diff>
--- a/content/files/brand-ownership.docx
+++ b/content/files/brand-ownership.docx
@@ -219,13 +219,6 @@
           <w:szCs w:val="24"/>
         </w:rPr>
         <w:t xml:space="preserve"> № 10</w:t>
-      </w:r>
-      <w:r>
-        <w:rPr>
-          <w:sz w:val="24"/>
-          <w:szCs w:val="24"/>
-        </w:rPr>
-        <w:t xml:space="preserve"> (далее – ПП ВС РФ № 10)</w:t>
       </w:r>
       <w:r>
         <w:rPr>
@@ -1746,8 +1739,6 @@
         <w:r>
           <w:rPr>
             <w:rStyle w:val="a5"/>
-            <w:b/>
-            <w:bCs/>
             <w:sz w:val="24"/>
           </w:rPr>
           <w:t>Воспользуйтесь нашим калькулятором</w:t>

</xml_diff>